<commit_message>
docs: updated individual diary with week 2 reflection
</commit_message>
<xml_diff>
--- a/Submissions/reflective-journal/FYP-26-S2-37_Individual-Diary_Yuan-Jun.docx
+++ b/Submissions/reflective-journal/FYP-26-S2-37_Individual-Diary_Yuan-Jun.docx
@@ -606,43 +606,13 @@
           <w:r>
             <w:fldChar w:fldCharType="separate"/>
           </w:r>
-          <w:hyperlink w:anchor="_Toc226788490" w:history="1">
+          <w:hyperlink w:anchor="_Toc227557039" w:history="1">
             <w:r>
               <w:rPr>
                 <w:rStyle w:val="Hyperlink"/>
                 <w:noProof/>
               </w:rPr>
-              <w:t>Week 01 – [4</w:t>
-            </w:r>
-            <w:r>
-              <w:rPr>
-                <w:rStyle w:val="Hyperlink"/>
-                <w:noProof/>
-                <w:vertAlign w:val="superscript"/>
-              </w:rPr>
-              <w:t>th</w:t>
-            </w:r>
-            <w:r>
-              <w:rPr>
-                <w:rStyle w:val="Hyperlink"/>
-                <w:noProof/>
-              </w:rPr>
-              <w:t xml:space="preserve"> Apr 26 – 11</w:t>
-            </w:r>
-            <w:r>
-              <w:rPr>
-                <w:rStyle w:val="Hyperlink"/>
-                <w:noProof/>
-                <w:vertAlign w:val="superscript"/>
-              </w:rPr>
-              <w:t>th</w:t>
-            </w:r>
-            <w:r>
-              <w:rPr>
-                <w:rStyle w:val="Hyperlink"/>
-                <w:noProof/>
-              </w:rPr>
-              <w:t xml:space="preserve"> Apr 26]</w:t>
+              <w:t>Week 01 – [4th Apr 26 – 10th Apr 26]</w:t>
             </w:r>
             <w:r>
               <w:rPr>
@@ -663,7 +633,7 @@
                 <w:noProof/>
                 <w:webHidden/>
               </w:rPr>
-              <w:instrText xml:space="preserve"> PAGEREF _Toc226788490 \h </w:instrText>
+              <w:instrText xml:space="preserve"> PAGEREF _Toc227557039 \h </w:instrText>
             </w:r>
             <w:r>
               <w:rPr>
@@ -704,7 +674,7 @@
               <w:noProof/>
             </w:rPr>
           </w:pPr>
-          <w:hyperlink w:anchor="_Toc226788491" w:history="1">
+          <w:hyperlink w:anchor="_Toc227557040" w:history="1">
             <w:r>
               <w:rPr>
                 <w:rStyle w:val="Hyperlink"/>
@@ -731,7 +701,7 @@
                 <w:noProof/>
                 <w:webHidden/>
               </w:rPr>
-              <w:instrText xml:space="preserve"> PAGEREF _Toc226788491 \h </w:instrText>
+              <w:instrText xml:space="preserve"> PAGEREF _Toc227557040 \h </w:instrText>
             </w:r>
             <w:r>
               <w:rPr>
@@ -772,7 +742,7 @@
               <w:noProof/>
             </w:rPr>
           </w:pPr>
-          <w:hyperlink w:anchor="_Toc226788492" w:history="1">
+          <w:hyperlink w:anchor="_Toc227557041" w:history="1">
             <w:r>
               <w:rPr>
                 <w:rStyle w:val="Hyperlink"/>
@@ -799,7 +769,7 @@
                 <w:noProof/>
                 <w:webHidden/>
               </w:rPr>
-              <w:instrText xml:space="preserve"> PAGEREF _Toc226788492 \h </w:instrText>
+              <w:instrText xml:space="preserve"> PAGEREF _Toc227557041 \h </w:instrText>
             </w:r>
             <w:r>
               <w:rPr>
@@ -840,7 +810,7 @@
               <w:noProof/>
             </w:rPr>
           </w:pPr>
-          <w:hyperlink w:anchor="_Toc226788493" w:history="1">
+          <w:hyperlink w:anchor="_Toc227557042" w:history="1">
             <w:r>
               <w:rPr>
                 <w:rStyle w:val="Hyperlink"/>
@@ -867,7 +837,7 @@
                 <w:noProof/>
                 <w:webHidden/>
               </w:rPr>
-              <w:instrText xml:space="preserve"> PAGEREF _Toc226788493 \h </w:instrText>
+              <w:instrText xml:space="preserve"> PAGEREF _Toc227557042 \h </w:instrText>
             </w:r>
             <w:r>
               <w:rPr>
@@ -887,7 +857,279 @@
                 <w:noProof/>
                 <w:webHidden/>
               </w:rPr>
-              <w:t>3</w:t>
+              <w:t>4</w:t>
+            </w:r>
+            <w:r>
+              <w:rPr>
+                <w:noProof/>
+                <w:webHidden/>
+              </w:rPr>
+              <w:fldChar w:fldCharType="end"/>
+            </w:r>
+          </w:hyperlink>
+        </w:p>
+        <w:p>
+          <w:pPr>
+            <w:pStyle w:val="TOC2"/>
+            <w:tabs>
+              <w:tab w:val="right" w:leader="dot" w:pos="9016"/>
+            </w:tabs>
+            <w:rPr>
+              <w:noProof/>
+            </w:rPr>
+          </w:pPr>
+          <w:hyperlink w:anchor="_Toc227557043" w:history="1">
+            <w:r>
+              <w:rPr>
+                <w:rStyle w:val="Hyperlink"/>
+                <w:noProof/>
+              </w:rPr>
+              <w:t>Week 02 – [11th Apr 26 – 17th Apr 26]</w:t>
+            </w:r>
+            <w:r>
+              <w:rPr>
+                <w:noProof/>
+                <w:webHidden/>
+              </w:rPr>
+              <w:tab/>
+            </w:r>
+            <w:r>
+              <w:rPr>
+                <w:noProof/>
+                <w:webHidden/>
+              </w:rPr>
+              <w:fldChar w:fldCharType="begin"/>
+            </w:r>
+            <w:r>
+              <w:rPr>
+                <w:noProof/>
+                <w:webHidden/>
+              </w:rPr>
+              <w:instrText xml:space="preserve"> PAGEREF _Toc227557043 \h </w:instrText>
+            </w:r>
+            <w:r>
+              <w:rPr>
+                <w:noProof/>
+                <w:webHidden/>
+              </w:rPr>
+            </w:r>
+            <w:r>
+              <w:rPr>
+                <w:noProof/>
+                <w:webHidden/>
+              </w:rPr>
+              <w:fldChar w:fldCharType="separate"/>
+            </w:r>
+            <w:r>
+              <w:rPr>
+                <w:noProof/>
+                <w:webHidden/>
+              </w:rPr>
+              <w:t>4</w:t>
+            </w:r>
+            <w:r>
+              <w:rPr>
+                <w:noProof/>
+                <w:webHidden/>
+              </w:rPr>
+              <w:fldChar w:fldCharType="end"/>
+            </w:r>
+          </w:hyperlink>
+        </w:p>
+        <w:p>
+          <w:pPr>
+            <w:pStyle w:val="TOC3"/>
+            <w:tabs>
+              <w:tab w:val="right" w:leader="dot" w:pos="9016"/>
+            </w:tabs>
+            <w:rPr>
+              <w:noProof/>
+            </w:rPr>
+          </w:pPr>
+          <w:hyperlink w:anchor="_Toc227557044" w:history="1">
+            <w:r>
+              <w:rPr>
+                <w:rStyle w:val="Hyperlink"/>
+                <w:noProof/>
+              </w:rPr>
+              <w:t>Objectives Achieved</w:t>
+            </w:r>
+            <w:r>
+              <w:rPr>
+                <w:noProof/>
+                <w:webHidden/>
+              </w:rPr>
+              <w:tab/>
+            </w:r>
+            <w:r>
+              <w:rPr>
+                <w:noProof/>
+                <w:webHidden/>
+              </w:rPr>
+              <w:fldChar w:fldCharType="begin"/>
+            </w:r>
+            <w:r>
+              <w:rPr>
+                <w:noProof/>
+                <w:webHidden/>
+              </w:rPr>
+              <w:instrText xml:space="preserve"> PAGEREF _Toc227557044 \h </w:instrText>
+            </w:r>
+            <w:r>
+              <w:rPr>
+                <w:noProof/>
+                <w:webHidden/>
+              </w:rPr>
+            </w:r>
+            <w:r>
+              <w:rPr>
+                <w:noProof/>
+                <w:webHidden/>
+              </w:rPr>
+              <w:fldChar w:fldCharType="separate"/>
+            </w:r>
+            <w:r>
+              <w:rPr>
+                <w:noProof/>
+                <w:webHidden/>
+              </w:rPr>
+              <w:t>4</w:t>
+            </w:r>
+            <w:r>
+              <w:rPr>
+                <w:noProof/>
+                <w:webHidden/>
+              </w:rPr>
+              <w:fldChar w:fldCharType="end"/>
+            </w:r>
+          </w:hyperlink>
+        </w:p>
+        <w:p>
+          <w:pPr>
+            <w:pStyle w:val="TOC3"/>
+            <w:tabs>
+              <w:tab w:val="right" w:leader="dot" w:pos="9016"/>
+            </w:tabs>
+            <w:rPr>
+              <w:noProof/>
+            </w:rPr>
+          </w:pPr>
+          <w:hyperlink w:anchor="_Toc227557045" w:history="1">
+            <w:r>
+              <w:rPr>
+                <w:rStyle w:val="Hyperlink"/>
+                <w:noProof/>
+              </w:rPr>
+              <w:t>Setbacks Faced</w:t>
+            </w:r>
+            <w:r>
+              <w:rPr>
+                <w:noProof/>
+                <w:webHidden/>
+              </w:rPr>
+              <w:tab/>
+            </w:r>
+            <w:r>
+              <w:rPr>
+                <w:noProof/>
+                <w:webHidden/>
+              </w:rPr>
+              <w:fldChar w:fldCharType="begin"/>
+            </w:r>
+            <w:r>
+              <w:rPr>
+                <w:noProof/>
+                <w:webHidden/>
+              </w:rPr>
+              <w:instrText xml:space="preserve"> PAGEREF _Toc227557045 \h </w:instrText>
+            </w:r>
+            <w:r>
+              <w:rPr>
+                <w:noProof/>
+                <w:webHidden/>
+              </w:rPr>
+            </w:r>
+            <w:r>
+              <w:rPr>
+                <w:noProof/>
+                <w:webHidden/>
+              </w:rPr>
+              <w:fldChar w:fldCharType="separate"/>
+            </w:r>
+            <w:r>
+              <w:rPr>
+                <w:noProof/>
+                <w:webHidden/>
+              </w:rPr>
+              <w:t>4</w:t>
+            </w:r>
+            <w:r>
+              <w:rPr>
+                <w:noProof/>
+                <w:webHidden/>
+              </w:rPr>
+              <w:fldChar w:fldCharType="end"/>
+            </w:r>
+          </w:hyperlink>
+        </w:p>
+        <w:p>
+          <w:pPr>
+            <w:pStyle w:val="TOC3"/>
+            <w:tabs>
+              <w:tab w:val="right" w:leader="dot" w:pos="9016"/>
+            </w:tabs>
+            <w:rPr>
+              <w:noProof/>
+            </w:rPr>
+          </w:pPr>
+          <w:hyperlink w:anchor="_Toc227557046" w:history="1">
+            <w:r>
+              <w:rPr>
+                <w:rStyle w:val="Hyperlink"/>
+                <w:noProof/>
+              </w:rPr>
+              <w:t>Reflection</w:t>
+            </w:r>
+            <w:r>
+              <w:rPr>
+                <w:noProof/>
+                <w:webHidden/>
+              </w:rPr>
+              <w:tab/>
+            </w:r>
+            <w:r>
+              <w:rPr>
+                <w:noProof/>
+                <w:webHidden/>
+              </w:rPr>
+              <w:fldChar w:fldCharType="begin"/>
+            </w:r>
+            <w:r>
+              <w:rPr>
+                <w:noProof/>
+                <w:webHidden/>
+              </w:rPr>
+              <w:instrText xml:space="preserve"> PAGEREF _Toc227557046 \h </w:instrText>
+            </w:r>
+            <w:r>
+              <w:rPr>
+                <w:noProof/>
+                <w:webHidden/>
+              </w:rPr>
+            </w:r>
+            <w:r>
+              <w:rPr>
+                <w:noProof/>
+                <w:webHidden/>
+              </w:rPr>
+              <w:fldChar w:fldCharType="separate"/>
+            </w:r>
+            <w:r>
+              <w:rPr>
+                <w:noProof/>
+                <w:webHidden/>
+              </w:rPr>
+              <w:t>5</w:t>
             </w:r>
             <w:r>
               <w:rPr>
@@ -1100,48 +1342,12 @@
     </w:p>
     <w:p>
       <w:pPr>
-        <w:rPr>
-          <w:rFonts w:ascii="Arial" w:hAnsi="Arial" w:cs="Arial"/>
-          <w:sz w:val="22"/>
-          <w:szCs w:val="22"/>
-        </w:rPr>
-      </w:pPr>
-    </w:p>
-    <w:p>
-      <w:pPr>
-        <w:rPr>
-          <w:rFonts w:ascii="Arial" w:hAnsi="Arial" w:cs="Arial"/>
-          <w:sz w:val="22"/>
-          <w:szCs w:val="22"/>
-        </w:rPr>
-      </w:pPr>
-    </w:p>
-    <w:p>
-      <w:pPr>
-        <w:rPr>
-          <w:rFonts w:ascii="Arial" w:hAnsi="Arial" w:cs="Arial"/>
-          <w:sz w:val="22"/>
-          <w:szCs w:val="22"/>
-        </w:rPr>
-      </w:pPr>
-    </w:p>
-    <w:p>
-      <w:pPr>
-        <w:rPr>
-          <w:rFonts w:ascii="Arial" w:hAnsi="Arial" w:cs="Arial"/>
-          <w:sz w:val="22"/>
-          <w:szCs w:val="22"/>
-        </w:rPr>
-      </w:pPr>
-    </w:p>
-    <w:p>
-      <w:pPr>
         <w:pStyle w:val="Heading2"/>
         <w:pBdr>
           <w:bottom w:val="single" w:sz="6" w:space="1" w:color="auto"/>
         </w:pBdr>
       </w:pPr>
-      <w:bookmarkStart w:id="0" w:name="_Toc226788490"/>
+      <w:bookmarkStart w:id="0" w:name="_Toc227557039"/>
       <w:r>
         <w:lastRenderedPageBreak/>
         <w:t xml:space="preserve">Week 01 </w:t>
@@ -1168,7 +1374,7 @@
       <w:pPr>
         <w:pStyle w:val="Heading3"/>
       </w:pPr>
-      <w:bookmarkStart w:id="1" w:name="_Toc226788491"/>
+      <w:bookmarkStart w:id="1" w:name="_Toc227557040"/>
       <w:r>
         <w:t>Objectives Achieved</w:t>
       </w:r>
@@ -1541,7 +1747,7 @@
       <w:pPr>
         <w:pStyle w:val="Heading3"/>
       </w:pPr>
-      <w:bookmarkStart w:id="2" w:name="_Toc226788492"/>
+      <w:bookmarkStart w:id="2" w:name="_Toc227557041"/>
       <w:r>
         <w:t>Setbacks Faced</w:t>
       </w:r>
@@ -1587,7 +1793,7 @@
       <w:pPr>
         <w:pStyle w:val="Heading3"/>
       </w:pPr>
-      <w:bookmarkStart w:id="3" w:name="_Toc226788493"/>
+      <w:bookmarkStart w:id="3" w:name="_Toc227557042"/>
       <w:r>
         <w:t>Reflection</w:t>
       </w:r>
@@ -1611,6 +1817,7 @@
           <w:bottom w:val="single" w:sz="6" w:space="1" w:color="auto"/>
         </w:pBdr>
       </w:pPr>
+      <w:bookmarkStart w:id="4" w:name="_Toc227557043"/>
       <w:r>
         <w:lastRenderedPageBreak/>
         <w:t>Week 0</w:t>
@@ -1633,15 +1840,18 @@
       <w:r>
         <w:t>th Apr 26]</w:t>
       </w:r>
+      <w:bookmarkEnd w:id="4"/>
     </w:p>
     <w:p/>
     <w:p>
       <w:pPr>
         <w:pStyle w:val="Heading3"/>
       </w:pPr>
+      <w:bookmarkStart w:id="5" w:name="_Toc227557044"/>
       <w:r>
         <w:t>Objectives Achieved</w:t>
       </w:r>
+      <w:bookmarkEnd w:id="5"/>
     </w:p>
     <w:p>
       <w:pPr>
@@ -1651,14 +1861,196 @@
           <w:numId w:val="4"/>
         </w:numPr>
       </w:pPr>
+      <w:r>
+        <w:t>Discussion with teammates on website design</w:t>
+      </w:r>
+    </w:p>
+    <w:p>
+      <w:pPr>
+        <w:pStyle w:val="ListParagraph"/>
+        <w:numPr>
+          <w:ilvl w:val="0"/>
+          <w:numId w:val="2"/>
+        </w:numPr>
+      </w:pPr>
+      <w:r>
+        <w:t>Went through each member’s vision for branding style for the whole project.</w:t>
+      </w:r>
+    </w:p>
+    <w:p>
+      <w:pPr>
+        <w:pStyle w:val="ListParagraph"/>
+        <w:numPr>
+          <w:ilvl w:val="0"/>
+          <w:numId w:val="2"/>
+        </w:numPr>
+      </w:pPr>
+      <w:r>
+        <w:t>Agreed on what branding style to use, Praveen will make some adjustments.</w:t>
+      </w:r>
+    </w:p>
+    <w:p>
+      <w:pPr>
+        <w:pStyle w:val="ListParagraph"/>
+        <w:numPr>
+          <w:ilvl w:val="0"/>
+          <w:numId w:val="2"/>
+        </w:numPr>
+      </w:pPr>
+      <w:r>
+        <w:t>Discussed on the features that the website should have, and how they should work.</w:t>
+      </w:r>
+    </w:p>
+    <w:p>
+      <w:pPr>
+        <w:pStyle w:val="ListParagraph"/>
+        <w:numPr>
+          <w:ilvl w:val="0"/>
+          <w:numId w:val="4"/>
+        </w:numPr>
+      </w:pPr>
+      <w:r>
+        <w:t xml:space="preserve">Discussion on </w:t>
+      </w:r>
+      <w:r>
+        <w:t xml:space="preserve">overall </w:t>
+      </w:r>
+      <w:r>
+        <w:t>project direction</w:t>
+      </w:r>
+    </w:p>
+    <w:p>
+      <w:pPr>
+        <w:pStyle w:val="ListParagraph"/>
+        <w:numPr>
+          <w:ilvl w:val="0"/>
+          <w:numId w:val="2"/>
+        </w:numPr>
+      </w:pPr>
+      <w:r>
+        <w:t>Discussed about our thoughts on the overall direction that we want to take the project based on our initial individual research.</w:t>
+      </w:r>
+    </w:p>
+    <w:p>
+      <w:pPr>
+        <w:pStyle w:val="ListParagraph"/>
+        <w:numPr>
+          <w:ilvl w:val="0"/>
+          <w:numId w:val="2"/>
+        </w:numPr>
+      </w:pPr>
+      <w:r>
+        <w:t>Gave each other feedback on how we can improve before our presentation during the first meeting with our supervisor.</w:t>
+      </w:r>
+    </w:p>
+    <w:p>
+      <w:pPr>
+        <w:pStyle w:val="ListParagraph"/>
+        <w:numPr>
+          <w:ilvl w:val="0"/>
+          <w:numId w:val="4"/>
+        </w:numPr>
+      </w:pPr>
+      <w:r>
+        <w:t>Created project website</w:t>
+      </w:r>
+    </w:p>
+    <w:p>
+      <w:pPr>
+        <w:pStyle w:val="ListParagraph"/>
+        <w:numPr>
+          <w:ilvl w:val="0"/>
+          <w:numId w:val="2"/>
+        </w:numPr>
+      </w:pPr>
+      <w:r>
+        <w:t>Used the branding kit to make things consistent.</w:t>
+      </w:r>
+    </w:p>
+    <w:p>
+      <w:pPr>
+        <w:pStyle w:val="ListParagraph"/>
+        <w:numPr>
+          <w:ilvl w:val="0"/>
+          <w:numId w:val="2"/>
+        </w:numPr>
+      </w:pPr>
+      <w:r>
+        <w:t>Added relevant features.</w:t>
+      </w:r>
+    </w:p>
+    <w:p>
+      <w:pPr>
+        <w:pStyle w:val="ListParagraph"/>
+        <w:numPr>
+          <w:ilvl w:val="0"/>
+          <w:numId w:val="4"/>
+        </w:numPr>
+      </w:pPr>
+      <w:r>
+        <w:t>First meeting with supervisor</w:t>
+      </w:r>
+    </w:p>
+    <w:p>
+      <w:pPr>
+        <w:pStyle w:val="ListParagraph"/>
+        <w:numPr>
+          <w:ilvl w:val="0"/>
+          <w:numId w:val="2"/>
+        </w:numPr>
+      </w:pPr>
+      <w:r>
+        <w:t>Highlighted general</w:t>
+      </w:r>
+      <w:r>
+        <w:t xml:space="preserve"> things to take note.</w:t>
+      </w:r>
+    </w:p>
+    <w:p>
+      <w:pPr>
+        <w:pStyle w:val="ListParagraph"/>
+        <w:numPr>
+          <w:ilvl w:val="0"/>
+          <w:numId w:val="2"/>
+        </w:numPr>
+      </w:pPr>
+      <w:r>
+        <w:t>Briefed on the project plan regarding we need to submit and by when.</w:t>
+      </w:r>
+    </w:p>
+    <w:p>
+      <w:pPr>
+        <w:pStyle w:val="ListParagraph"/>
+        <w:numPr>
+          <w:ilvl w:val="0"/>
+          <w:numId w:val="2"/>
+        </w:numPr>
+      </w:pPr>
+      <w:r>
+        <w:t>Presented individual research and our supervisor’s feedback on what we can improve on.</w:t>
+      </w:r>
+    </w:p>
+    <w:p>
+      <w:pPr>
+        <w:pStyle w:val="ListParagraph"/>
+        <w:numPr>
+          <w:ilvl w:val="0"/>
+          <w:numId w:val="2"/>
+        </w:numPr>
+      </w:pPr>
+      <w:r>
+        <w:t>Supervisor went through what our next steps are and what are some key points that he wants us to take note of, with examples.</w:t>
+      </w:r>
     </w:p>
     <w:p>
       <w:pPr>
         <w:pStyle w:val="Heading3"/>
       </w:pPr>
+      <w:bookmarkStart w:id="6" w:name="_Toc227557045"/>
       <w:r>
         <w:t>Setbacks Faced</w:t>
       </w:r>
+      <w:bookmarkEnd w:id="6"/>
     </w:p>
     <w:p>
       <w:pPr>
@@ -1668,24 +2060,78 @@
           <w:numId w:val="5"/>
         </w:numPr>
       </w:pPr>
+      <w:r>
+        <w:t>Difficulty aligning everyone’s design preferences</w:t>
+      </w:r>
+    </w:p>
+    <w:p>
+      <w:pPr>
+        <w:pStyle w:val="ListParagraph"/>
+        <w:numPr>
+          <w:ilvl w:val="0"/>
+          <w:numId w:val="2"/>
+        </w:numPr>
+      </w:pPr>
+      <w:r>
+        <w:t>Everyone had different ideas on the branding style, website layout, etc, so it took a lot of  discussion to agree on a design direction.</w:t>
+      </w:r>
+    </w:p>
+    <w:p>
+      <w:pPr>
+        <w:pStyle w:val="ListParagraph"/>
+        <w:numPr>
+          <w:ilvl w:val="0"/>
+          <w:numId w:val="5"/>
+        </w:numPr>
+      </w:pPr>
+      <w:r>
+        <w:t>Building of website took more time than expected</w:t>
+      </w:r>
+    </w:p>
+    <w:p>
+      <w:pPr>
+        <w:pStyle w:val="ListParagraph"/>
+        <w:numPr>
+          <w:ilvl w:val="0"/>
+          <w:numId w:val="5"/>
+        </w:numPr>
+      </w:pPr>
+      <w:r>
+        <w:t>Need to refine research after supervisor feedback</w:t>
+      </w:r>
     </w:p>
     <w:p>
       <w:pPr>
         <w:pStyle w:val="Heading3"/>
       </w:pPr>
+      <w:bookmarkStart w:id="7" w:name="_Toc227557046"/>
       <w:r>
         <w:t>Reflection</w:t>
       </w:r>
-    </w:p>
-    <w:p>
-      <w:r>
-        <w:t>a</w:t>
-      </w:r>
-    </w:p>
-    <w:p>
-      <w:pPr>
-        <w:jc w:val="both"/>
-      </w:pPr>
+      <w:bookmarkEnd w:id="7"/>
+    </w:p>
+    <w:p>
+      <w:r>
+        <w:t xml:space="preserve">This week was productive as </w:t>
+      </w:r>
+      <w:r>
+        <w:t xml:space="preserve">we </w:t>
+      </w:r>
+      <w:r>
+        <w:t>aligned on a common branding style</w:t>
+      </w:r>
+      <w:r>
+        <w:t xml:space="preserve">, </w:t>
+      </w:r>
+      <w:r>
+        <w:t xml:space="preserve">created the project website, and attended our first meeting with </w:t>
+      </w:r>
+      <w:r>
+        <w:t>our</w:t>
+      </w:r>
+      <w:r>
+        <w:t xml:space="preserve"> supervisor. The meeting helped clarify project expectations, deliverables, and areas where our research could be improved. However, we faced some challenges, such as differing design preferences among team members, the website taking longer to build than expected, and the need to refine our research after receiving feedback. Overall, the week helped us establish a clearer direction for the project and highlighted the areas we need to work on next.</w:t>
+      </w:r>
     </w:p>
     <w:sectPr>
       <w:pgSz w:w="11906" w:h="16838"/>
@@ -1804,7 +2250,7 @@
         <w:rFonts w:hint="default"/>
       </w:rPr>
     </w:lvl>
-    <w:lvl w:ilvl="1" w:tplc="08090019" w:tentative="1">
+    <w:lvl w:ilvl="1" w:tplc="08090019">
       <w:start w:val="1"/>
       <w:numFmt w:val="lowerLetter"/>
       <w:lvlText w:val="%2."/>
@@ -2092,7 +2538,7 @@
         <w:rFonts w:hint="default"/>
       </w:rPr>
     </w:lvl>
-    <w:lvl w:ilvl="1" w:tplc="08090019" w:tentative="1">
+    <w:lvl w:ilvl="1" w:tplc="08090019">
       <w:start w:val="1"/>
       <w:numFmt w:val="lowerLetter"/>
       <w:lvlText w:val="%2."/>

</xml_diff>